<commit_message>
Update - Fixed initiative tracker
</commit_message>
<xml_diff>
--- a/rulebooks/one_dnd_rulebook_fr.docx
+++ b/rulebooks/one_dnd_rulebook_fr.docx
@@ -288,9 +288,6 @@
             <w:tabs>
               <w:tab w:val="right" w:leader="dot" w:pos="9062"/>
             </w:tabs>
-            <w:rPr>
-              <w:noProof/>
-            </w:rPr>
             <w:sectPr>
               <w:headerReference w:type="default" r:id="rId9"/>
               <w:footerReference w:type="default" r:id="rId10"/>
@@ -327,7 +324,7 @@
               <w14:ligatures w14:val="standardContextual"/>
             </w:rPr>
           </w:pPr>
-          <w:hyperlink w:anchor="_Toc241143670" w:history="1">
+          <w:hyperlink w:anchor="_Toc241229624" w:history="1">
             <w:r>
               <w:rPr>
                 <w:rStyle w:val="Lienhypertexte"/>
@@ -354,7 +351,7 @@
                 <w:noProof/>
                 <w:webHidden/>
               </w:rPr>
-              <w:instrText xml:space="preserve"> PAGEREF _Toc241143670 \h </w:instrText>
+              <w:instrText xml:space="preserve"> PAGEREF _Toc241229624 \h </w:instrText>
             </w:r>
             <w:r>
               <w:rPr>
@@ -399,7 +396,7 @@
               <w14:ligatures w14:val="standardContextual"/>
             </w:rPr>
           </w:pPr>
-          <w:hyperlink w:anchor="_Toc241143671" w:history="1">
+          <w:hyperlink w:anchor="_Toc241229625" w:history="1">
             <w:r>
               <w:rPr>
                 <w:rStyle w:val="Lienhypertexte"/>
@@ -426,7 +423,7 @@
                 <w:noProof/>
                 <w:webHidden/>
               </w:rPr>
-              <w:instrText xml:space="preserve"> PAGEREF _Toc241143671 \h </w:instrText>
+              <w:instrText xml:space="preserve"> PAGEREF _Toc241229625 \h </w:instrText>
             </w:r>
             <w:r>
               <w:rPr>
@@ -471,7 +468,7 @@
               <w14:ligatures w14:val="standardContextual"/>
             </w:rPr>
           </w:pPr>
-          <w:hyperlink w:anchor="_Toc241143672" w:history="1">
+          <w:hyperlink w:anchor="_Toc241229626" w:history="1">
             <w:r>
               <w:rPr>
                 <w:rStyle w:val="Lienhypertexte"/>
@@ -498,7 +495,7 @@
                 <w:noProof/>
                 <w:webHidden/>
               </w:rPr>
-              <w:instrText xml:space="preserve"> PAGEREF _Toc241143672 \h </w:instrText>
+              <w:instrText xml:space="preserve"> PAGEREF _Toc241229626 \h </w:instrText>
             </w:r>
             <w:r>
               <w:rPr>
@@ -543,7 +540,7 @@
               <w14:ligatures w14:val="standardContextual"/>
             </w:rPr>
           </w:pPr>
-          <w:hyperlink w:anchor="_Toc241143673" w:history="1">
+          <w:hyperlink w:anchor="_Toc241229627" w:history="1">
             <w:r>
               <w:rPr>
                 <w:rStyle w:val="Lienhypertexte"/>
@@ -570,7 +567,7 @@
                 <w:noProof/>
                 <w:webHidden/>
               </w:rPr>
-              <w:instrText xml:space="preserve"> PAGEREF _Toc241143673 \h </w:instrText>
+              <w:instrText xml:space="preserve"> PAGEREF _Toc241229627 \h </w:instrText>
             </w:r>
             <w:r>
               <w:rPr>
@@ -615,7 +612,7 @@
               <w14:ligatures w14:val="standardContextual"/>
             </w:rPr>
           </w:pPr>
-          <w:hyperlink w:anchor="_Toc241143674" w:history="1">
+          <w:hyperlink w:anchor="_Toc241229628" w:history="1">
             <w:r>
               <w:rPr>
                 <w:rStyle w:val="Lienhypertexte"/>
@@ -642,7 +639,7 @@
                 <w:noProof/>
                 <w:webHidden/>
               </w:rPr>
-              <w:instrText xml:space="preserve"> PAGEREF _Toc241143674 \h </w:instrText>
+              <w:instrText xml:space="preserve"> PAGEREF _Toc241229628 \h </w:instrText>
             </w:r>
             <w:r>
               <w:rPr>
@@ -687,7 +684,7 @@
               <w14:ligatures w14:val="standardContextual"/>
             </w:rPr>
           </w:pPr>
-          <w:hyperlink w:anchor="_Toc241143675" w:history="1">
+          <w:hyperlink w:anchor="_Toc241229629" w:history="1">
             <w:r>
               <w:rPr>
                 <w:rStyle w:val="Lienhypertexte"/>
@@ -714,7 +711,7 @@
                 <w:noProof/>
                 <w:webHidden/>
               </w:rPr>
-              <w:instrText xml:space="preserve"> PAGEREF _Toc241143675 \h </w:instrText>
+              <w:instrText xml:space="preserve"> PAGEREF _Toc241229629 \h </w:instrText>
             </w:r>
             <w:r>
               <w:rPr>
@@ -759,7 +756,7 @@
               <w14:ligatures w14:val="standardContextual"/>
             </w:rPr>
           </w:pPr>
-          <w:hyperlink w:anchor="_Toc241143676" w:history="1">
+          <w:hyperlink w:anchor="_Toc241229630" w:history="1">
             <w:r>
               <w:rPr>
                 <w:rStyle w:val="Lienhypertexte"/>
@@ -786,7 +783,7 @@
                 <w:noProof/>
                 <w:webHidden/>
               </w:rPr>
-              <w:instrText xml:space="preserve"> PAGEREF _Toc241143676 \h </w:instrText>
+              <w:instrText xml:space="preserve"> PAGEREF _Toc241229630 \h </w:instrText>
             </w:r>
             <w:r>
               <w:rPr>
@@ -831,7 +828,7 @@
               <w14:ligatures w14:val="standardContextual"/>
             </w:rPr>
           </w:pPr>
-          <w:hyperlink w:anchor="_Toc241143677" w:history="1">
+          <w:hyperlink w:anchor="_Toc241229631" w:history="1">
             <w:r>
               <w:rPr>
                 <w:rStyle w:val="Lienhypertexte"/>
@@ -858,7 +855,7 @@
                 <w:noProof/>
                 <w:webHidden/>
               </w:rPr>
-              <w:instrText xml:space="preserve"> PAGEREF _Toc241143677 \h </w:instrText>
+              <w:instrText xml:space="preserve"> PAGEREF _Toc241229631 \h </w:instrText>
             </w:r>
             <w:r>
               <w:rPr>
@@ -903,7 +900,7 @@
               <w14:ligatures w14:val="standardContextual"/>
             </w:rPr>
           </w:pPr>
-          <w:hyperlink w:anchor="_Toc241143678" w:history="1">
+          <w:hyperlink w:anchor="_Toc241229632" w:history="1">
             <w:r>
               <w:rPr>
                 <w:rStyle w:val="Lienhypertexte"/>
@@ -930,7 +927,7 @@
                 <w:noProof/>
                 <w:webHidden/>
               </w:rPr>
-              <w:instrText xml:space="preserve"> PAGEREF _Toc241143678 \h </w:instrText>
+              <w:instrText xml:space="preserve"> PAGEREF _Toc241229632 \h </w:instrText>
             </w:r>
             <w:r>
               <w:rPr>
@@ -975,7 +972,7 @@
               <w14:ligatures w14:val="standardContextual"/>
             </w:rPr>
           </w:pPr>
-          <w:hyperlink w:anchor="_Toc241143679" w:history="1">
+          <w:hyperlink w:anchor="_Toc241229633" w:history="1">
             <w:r>
               <w:rPr>
                 <w:rStyle w:val="Lienhypertexte"/>
@@ -1002,7 +999,7 @@
                 <w:noProof/>
                 <w:webHidden/>
               </w:rPr>
-              <w:instrText xml:space="preserve"> PAGEREF _Toc241143679 \h </w:instrText>
+              <w:instrText xml:space="preserve"> PAGEREF _Toc241229633 \h </w:instrText>
             </w:r>
             <w:r>
               <w:rPr>
@@ -1047,7 +1044,7 @@
               <w14:ligatures w14:val="standardContextual"/>
             </w:rPr>
           </w:pPr>
-          <w:hyperlink w:anchor="_Toc241143680" w:history="1">
+          <w:hyperlink w:anchor="_Toc241229634" w:history="1">
             <w:r>
               <w:rPr>
                 <w:rStyle w:val="Lienhypertexte"/>
@@ -1074,7 +1071,7 @@
                 <w:noProof/>
                 <w:webHidden/>
               </w:rPr>
-              <w:instrText xml:space="preserve"> PAGEREF _Toc241143680 \h </w:instrText>
+              <w:instrText xml:space="preserve"> PAGEREF _Toc241229634 \h </w:instrText>
             </w:r>
             <w:r>
               <w:rPr>
@@ -1119,7 +1116,7 @@
               <w14:ligatures w14:val="standardContextual"/>
             </w:rPr>
           </w:pPr>
-          <w:hyperlink w:anchor="_Toc241143681" w:history="1">
+          <w:hyperlink w:anchor="_Toc241229635" w:history="1">
             <w:r>
               <w:rPr>
                 <w:rStyle w:val="Lienhypertexte"/>
@@ -1146,7 +1143,7 @@
                 <w:noProof/>
                 <w:webHidden/>
               </w:rPr>
-              <w:instrText xml:space="preserve"> PAGEREF _Toc241143681 \h </w:instrText>
+              <w:instrText xml:space="preserve"> PAGEREF _Toc241229635 \h </w:instrText>
             </w:r>
             <w:r>
               <w:rPr>
@@ -1191,7 +1188,7 @@
               <w14:ligatures w14:val="standardContextual"/>
             </w:rPr>
           </w:pPr>
-          <w:hyperlink w:anchor="_Toc241143682" w:history="1">
+          <w:hyperlink w:anchor="_Toc241229636" w:history="1">
             <w:r>
               <w:rPr>
                 <w:rStyle w:val="Lienhypertexte"/>
@@ -1218,7 +1215,7 @@
                 <w:noProof/>
                 <w:webHidden/>
               </w:rPr>
-              <w:instrText xml:space="preserve"> PAGEREF _Toc241143682 \h </w:instrText>
+              <w:instrText xml:space="preserve"> PAGEREF _Toc241229636 \h </w:instrText>
             </w:r>
             <w:r>
               <w:rPr>
@@ -1263,7 +1260,7 @@
               <w14:ligatures w14:val="standardContextual"/>
             </w:rPr>
           </w:pPr>
-          <w:hyperlink w:anchor="_Toc241143683" w:history="1">
+          <w:hyperlink w:anchor="_Toc241229637" w:history="1">
             <w:r>
               <w:rPr>
                 <w:rStyle w:val="Lienhypertexte"/>
@@ -1290,7 +1287,7 @@
                 <w:noProof/>
                 <w:webHidden/>
               </w:rPr>
-              <w:instrText xml:space="preserve"> PAGEREF _Toc241143683 \h </w:instrText>
+              <w:instrText xml:space="preserve"> PAGEREF _Toc241229637 \h </w:instrText>
             </w:r>
             <w:r>
               <w:rPr>
@@ -1335,7 +1332,7 @@
               <w14:ligatures w14:val="standardContextual"/>
             </w:rPr>
           </w:pPr>
-          <w:hyperlink w:anchor="_Toc241143684" w:history="1">
+          <w:hyperlink w:anchor="_Toc241229638" w:history="1">
             <w:r>
               <w:rPr>
                 <w:rStyle w:val="Lienhypertexte"/>
@@ -1362,7 +1359,7 @@
                 <w:noProof/>
                 <w:webHidden/>
               </w:rPr>
-              <w:instrText xml:space="preserve"> PAGEREF _Toc241143684 \h </w:instrText>
+              <w:instrText xml:space="preserve"> PAGEREF _Toc241229638 \h </w:instrText>
             </w:r>
             <w:r>
               <w:rPr>
@@ -1407,7 +1404,7 @@
               <w14:ligatures w14:val="standardContextual"/>
             </w:rPr>
           </w:pPr>
-          <w:hyperlink w:anchor="_Toc241143685" w:history="1">
+          <w:hyperlink w:anchor="_Toc241229639" w:history="1">
             <w:r>
               <w:rPr>
                 <w:rStyle w:val="Lienhypertexte"/>
@@ -1434,7 +1431,7 @@
                 <w:noProof/>
                 <w:webHidden/>
               </w:rPr>
-              <w:instrText xml:space="preserve"> PAGEREF _Toc241143685 \h </w:instrText>
+              <w:instrText xml:space="preserve"> PAGEREF _Toc241229639 \h </w:instrText>
             </w:r>
             <w:r>
               <w:rPr>
@@ -1479,7 +1476,7 @@
               <w14:ligatures w14:val="standardContextual"/>
             </w:rPr>
           </w:pPr>
-          <w:hyperlink w:anchor="_Toc241143686" w:history="1">
+          <w:hyperlink w:anchor="_Toc241229640" w:history="1">
             <w:r>
               <w:rPr>
                 <w:rStyle w:val="Lienhypertexte"/>
@@ -1506,7 +1503,7 @@
                 <w:noProof/>
                 <w:webHidden/>
               </w:rPr>
-              <w:instrText xml:space="preserve"> PAGEREF _Toc241143686 \h </w:instrText>
+              <w:instrText xml:space="preserve"> PAGEREF _Toc241229640 \h </w:instrText>
             </w:r>
             <w:r>
               <w:rPr>
@@ -1551,7 +1548,7 @@
               <w14:ligatures w14:val="standardContextual"/>
             </w:rPr>
           </w:pPr>
-          <w:hyperlink w:anchor="_Toc241143687" w:history="1">
+          <w:hyperlink w:anchor="_Toc241229641" w:history="1">
             <w:r>
               <w:rPr>
                 <w:rStyle w:val="Lienhypertexte"/>
@@ -1578,7 +1575,7 @@
                 <w:noProof/>
                 <w:webHidden/>
               </w:rPr>
-              <w:instrText xml:space="preserve"> PAGEREF _Toc241143687 \h </w:instrText>
+              <w:instrText xml:space="preserve"> PAGEREF _Toc241229641 \h </w:instrText>
             </w:r>
             <w:r>
               <w:rPr>
@@ -1623,7 +1620,7 @@
               <w14:ligatures w14:val="standardContextual"/>
             </w:rPr>
           </w:pPr>
-          <w:hyperlink w:anchor="_Toc241143688" w:history="1">
+          <w:hyperlink w:anchor="_Toc241229642" w:history="1">
             <w:r>
               <w:rPr>
                 <w:rStyle w:val="Lienhypertexte"/>
@@ -1650,7 +1647,7 @@
                 <w:noProof/>
                 <w:webHidden/>
               </w:rPr>
-              <w:instrText xml:space="preserve"> PAGEREF _Toc241143688 \h </w:instrText>
+              <w:instrText xml:space="preserve"> PAGEREF _Toc241229642 \h </w:instrText>
             </w:r>
             <w:r>
               <w:rPr>
@@ -1695,7 +1692,7 @@
               <w14:ligatures w14:val="standardContextual"/>
             </w:rPr>
           </w:pPr>
-          <w:hyperlink w:anchor="_Toc241143689" w:history="1">
+          <w:hyperlink w:anchor="_Toc241229643" w:history="1">
             <w:r>
               <w:rPr>
                 <w:rStyle w:val="Lienhypertexte"/>
@@ -1722,7 +1719,7 @@
                 <w:noProof/>
                 <w:webHidden/>
               </w:rPr>
-              <w:instrText xml:space="preserve"> PAGEREF _Toc241143689 \h </w:instrText>
+              <w:instrText xml:space="preserve"> PAGEREF _Toc241229643 \h </w:instrText>
             </w:r>
             <w:r>
               <w:rPr>
@@ -1767,7 +1764,7 @@
               <w14:ligatures w14:val="standardContextual"/>
             </w:rPr>
           </w:pPr>
-          <w:hyperlink w:anchor="_Toc241143690" w:history="1">
+          <w:hyperlink w:anchor="_Toc241229644" w:history="1">
             <w:r>
               <w:rPr>
                 <w:rStyle w:val="Lienhypertexte"/>
@@ -1794,7 +1791,7 @@
                 <w:noProof/>
                 <w:webHidden/>
               </w:rPr>
-              <w:instrText xml:space="preserve"> PAGEREF _Toc241143690 \h </w:instrText>
+              <w:instrText xml:space="preserve"> PAGEREF _Toc241229644 \h </w:instrText>
             </w:r>
             <w:r>
               <w:rPr>
@@ -1839,7 +1836,7 @@
               <w14:ligatures w14:val="standardContextual"/>
             </w:rPr>
           </w:pPr>
-          <w:hyperlink w:anchor="_Toc241143691" w:history="1">
+          <w:hyperlink w:anchor="_Toc241229645" w:history="1">
             <w:r>
               <w:rPr>
                 <w:rStyle w:val="Lienhypertexte"/>
@@ -1866,7 +1863,7 @@
                 <w:noProof/>
                 <w:webHidden/>
               </w:rPr>
-              <w:instrText xml:space="preserve"> PAGEREF _Toc241143691 \h </w:instrText>
+              <w:instrText xml:space="preserve"> PAGEREF _Toc241229645 \h </w:instrText>
             </w:r>
             <w:r>
               <w:rPr>
@@ -1911,7 +1908,7 @@
               <w14:ligatures w14:val="standardContextual"/>
             </w:rPr>
           </w:pPr>
-          <w:hyperlink w:anchor="_Toc241143692" w:history="1">
+          <w:hyperlink w:anchor="_Toc241229646" w:history="1">
             <w:r>
               <w:rPr>
                 <w:rStyle w:val="Lienhypertexte"/>
@@ -1938,7 +1935,7 @@
                 <w:noProof/>
                 <w:webHidden/>
               </w:rPr>
-              <w:instrText xml:space="preserve"> PAGEREF _Toc241143692 \h </w:instrText>
+              <w:instrText xml:space="preserve"> PAGEREF _Toc241229646 \h </w:instrText>
             </w:r>
             <w:r>
               <w:rPr>
@@ -1983,7 +1980,7 @@
               <w14:ligatures w14:val="standardContextual"/>
             </w:rPr>
           </w:pPr>
-          <w:hyperlink w:anchor="_Toc241143693" w:history="1">
+          <w:hyperlink w:anchor="_Toc241229647" w:history="1">
             <w:r>
               <w:rPr>
                 <w:rStyle w:val="Lienhypertexte"/>
@@ -2010,7 +2007,7 @@
                 <w:noProof/>
                 <w:webHidden/>
               </w:rPr>
-              <w:instrText xml:space="preserve"> PAGEREF _Toc241143693 \h </w:instrText>
+              <w:instrText xml:space="preserve"> PAGEREF _Toc241229647 \h </w:instrText>
             </w:r>
             <w:r>
               <w:rPr>
@@ -2055,7 +2052,7 @@
               <w14:ligatures w14:val="standardContextual"/>
             </w:rPr>
           </w:pPr>
-          <w:hyperlink w:anchor="_Toc241143694" w:history="1">
+          <w:hyperlink w:anchor="_Toc241229648" w:history="1">
             <w:r>
               <w:rPr>
                 <w:rStyle w:val="Lienhypertexte"/>
@@ -2082,7 +2079,7 @@
                 <w:noProof/>
                 <w:webHidden/>
               </w:rPr>
-              <w:instrText xml:space="preserve"> PAGEREF _Toc241143694 \h </w:instrText>
+              <w:instrText xml:space="preserve"> PAGEREF _Toc241229648 \h </w:instrText>
             </w:r>
             <w:r>
               <w:rPr>
@@ -2127,7 +2124,7 @@
               <w14:ligatures w14:val="standardContextual"/>
             </w:rPr>
           </w:pPr>
-          <w:hyperlink w:anchor="_Toc241143695" w:history="1">
+          <w:hyperlink w:anchor="_Toc241229649" w:history="1">
             <w:r>
               <w:rPr>
                 <w:rStyle w:val="Lienhypertexte"/>
@@ -2154,7 +2151,7 @@
                 <w:noProof/>
                 <w:webHidden/>
               </w:rPr>
-              <w:instrText xml:space="preserve"> PAGEREF _Toc241143695 \h </w:instrText>
+              <w:instrText xml:space="preserve"> PAGEREF _Toc241229649 \h </w:instrText>
             </w:r>
             <w:r>
               <w:rPr>
@@ -2199,7 +2196,7 @@
               <w14:ligatures w14:val="standardContextual"/>
             </w:rPr>
           </w:pPr>
-          <w:hyperlink w:anchor="_Toc241143696" w:history="1">
+          <w:hyperlink w:anchor="_Toc241229650" w:history="1">
             <w:r>
               <w:rPr>
                 <w:rStyle w:val="Lienhypertexte"/>
@@ -2226,7 +2223,7 @@
                 <w:noProof/>
                 <w:webHidden/>
               </w:rPr>
-              <w:instrText xml:space="preserve"> PAGEREF _Toc241143696 \h </w:instrText>
+              <w:instrText xml:space="preserve"> PAGEREF _Toc241229650 \h </w:instrText>
             </w:r>
             <w:r>
               <w:rPr>
@@ -2271,7 +2268,7 @@
               <w14:ligatures w14:val="standardContextual"/>
             </w:rPr>
           </w:pPr>
-          <w:hyperlink w:anchor="_Toc241143697" w:history="1">
+          <w:hyperlink w:anchor="_Toc241229651" w:history="1">
             <w:r>
               <w:rPr>
                 <w:rStyle w:val="Lienhypertexte"/>
@@ -2298,7 +2295,7 @@
                 <w:noProof/>
                 <w:webHidden/>
               </w:rPr>
-              <w:instrText xml:space="preserve"> PAGEREF _Toc241143697 \h </w:instrText>
+              <w:instrText xml:space="preserve"> PAGEREF _Toc241229651 \h </w:instrText>
             </w:r>
             <w:r>
               <w:rPr>
@@ -2343,7 +2340,7 @@
               <w14:ligatures w14:val="standardContextual"/>
             </w:rPr>
           </w:pPr>
-          <w:hyperlink w:anchor="_Toc241143698" w:history="1">
+          <w:hyperlink w:anchor="_Toc241229652" w:history="1">
             <w:r>
               <w:rPr>
                 <w:rStyle w:val="Lienhypertexte"/>
@@ -2370,7 +2367,7 @@
                 <w:noProof/>
                 <w:webHidden/>
               </w:rPr>
-              <w:instrText xml:space="preserve"> PAGEREF _Toc241143698 \h </w:instrText>
+              <w:instrText xml:space="preserve"> PAGEREF _Toc241229652 \h </w:instrText>
             </w:r>
             <w:r>
               <w:rPr>
@@ -2415,7 +2412,7 @@
               <w14:ligatures w14:val="standardContextual"/>
             </w:rPr>
           </w:pPr>
-          <w:hyperlink w:anchor="_Toc241143699" w:history="1">
+          <w:hyperlink w:anchor="_Toc241229653" w:history="1">
             <w:r>
               <w:rPr>
                 <w:rStyle w:val="Lienhypertexte"/>
@@ -2442,7 +2439,7 @@
                 <w:noProof/>
                 <w:webHidden/>
               </w:rPr>
-              <w:instrText xml:space="preserve"> PAGEREF _Toc241143699 \h </w:instrText>
+              <w:instrText xml:space="preserve"> PAGEREF _Toc241229653 \h </w:instrText>
             </w:r>
             <w:r>
               <w:rPr>
@@ -2487,7 +2484,7 @@
               <w14:ligatures w14:val="standardContextual"/>
             </w:rPr>
           </w:pPr>
-          <w:hyperlink w:anchor="_Toc241143700" w:history="1">
+          <w:hyperlink w:anchor="_Toc241229654" w:history="1">
             <w:r>
               <w:rPr>
                 <w:rStyle w:val="Lienhypertexte"/>
@@ -2514,7 +2511,7 @@
                 <w:noProof/>
                 <w:webHidden/>
               </w:rPr>
-              <w:instrText xml:space="preserve"> PAGEREF _Toc241143700 \h </w:instrText>
+              <w:instrText xml:space="preserve"> PAGEREF _Toc241229654 \h </w:instrText>
             </w:r>
             <w:r>
               <w:rPr>
@@ -2559,7 +2556,7 @@
               <w14:ligatures w14:val="standardContextual"/>
             </w:rPr>
           </w:pPr>
-          <w:hyperlink w:anchor="_Toc241143701" w:history="1">
+          <w:hyperlink w:anchor="_Toc241229655" w:history="1">
             <w:r>
               <w:rPr>
                 <w:rStyle w:val="Lienhypertexte"/>
@@ -2586,7 +2583,7 @@
                 <w:noProof/>
                 <w:webHidden/>
               </w:rPr>
-              <w:instrText xml:space="preserve"> PAGEREF _Toc241143701 \h </w:instrText>
+              <w:instrText xml:space="preserve"> PAGEREF _Toc241229655 \h </w:instrText>
             </w:r>
             <w:r>
               <w:rPr>
@@ -2631,7 +2628,7 @@
               <w14:ligatures w14:val="standardContextual"/>
             </w:rPr>
           </w:pPr>
-          <w:hyperlink w:anchor="_Toc241143702" w:history="1">
+          <w:hyperlink w:anchor="_Toc241229656" w:history="1">
             <w:r>
               <w:rPr>
                 <w:rStyle w:val="Lienhypertexte"/>
@@ -2658,7 +2655,7 @@
                 <w:noProof/>
                 <w:webHidden/>
               </w:rPr>
-              <w:instrText xml:space="preserve"> PAGEREF _Toc241143702 \h </w:instrText>
+              <w:instrText xml:space="preserve"> PAGEREF _Toc241229656 \h </w:instrText>
             </w:r>
             <w:r>
               <w:rPr>
@@ -2703,13 +2700,13 @@
               <w14:ligatures w14:val="standardContextual"/>
             </w:rPr>
           </w:pPr>
-          <w:hyperlink w:anchor="_Toc241143703" w:history="1">
+          <w:hyperlink w:anchor="_Toc241229657" w:history="1">
             <w:r>
               <w:rPr>
                 <w:rStyle w:val="Lienhypertexte"/>
                 <w:noProof/>
               </w:rPr>
-              <w:t>Taia, the Cleric</w:t>
+              <w:t>Taia, la Clerc</w:t>
             </w:r>
             <w:r>
               <w:rPr>
@@ -2730,7 +2727,7 @@
                 <w:noProof/>
                 <w:webHidden/>
               </w:rPr>
-              <w:instrText xml:space="preserve"> PAGEREF _Toc241143703 \h </w:instrText>
+              <w:instrText xml:space="preserve"> PAGEREF _Toc241229657 \h </w:instrText>
             </w:r>
             <w:r>
               <w:rPr>
@@ -2775,13 +2772,13 @@
               <w14:ligatures w14:val="standardContextual"/>
             </w:rPr>
           </w:pPr>
-          <w:hyperlink w:anchor="_Toc241143704" w:history="1">
+          <w:hyperlink w:anchor="_Toc241229658" w:history="1">
             <w:r>
               <w:rPr>
                 <w:rStyle w:val="Lienhypertexte"/>
                 <w:noProof/>
               </w:rPr>
-              <w:t>Elspeth, the Battle Master (SKE)</w:t>
+              <w:t>Elspeth, la Maîtresse de Guerre (SKE)</w:t>
             </w:r>
             <w:r>
               <w:rPr>
@@ -2802,7 +2799,7 @@
                 <w:noProof/>
                 <w:webHidden/>
               </w:rPr>
-              <w:instrText xml:space="preserve"> PAGEREF _Toc241143704 \h </w:instrText>
+              <w:instrText xml:space="preserve"> PAGEREF _Toc241229658 \h </w:instrText>
             </w:r>
             <w:r>
               <w:rPr>
@@ -2847,13 +2844,13 @@
               <w14:ligatures w14:val="standardContextual"/>
             </w:rPr>
           </w:pPr>
-          <w:hyperlink w:anchor="_Toc241143705" w:history="1">
+          <w:hyperlink w:anchor="_Toc241229659" w:history="1">
             <w:r>
               <w:rPr>
                 <w:rStyle w:val="Lienhypertexte"/>
                 <w:noProof/>
               </w:rPr>
-              <w:t>Hannah, the Thief (Regent)</w:t>
+              <w:t>Hannah, la Voleuse (Regent)</w:t>
             </w:r>
             <w:r>
               <w:rPr>
@@ -2874,7 +2871,7 @@
                 <w:noProof/>
                 <w:webHidden/>
               </w:rPr>
-              <w:instrText xml:space="preserve"> PAGEREF _Toc241143705 \h </w:instrText>
+              <w:instrText xml:space="preserve"> PAGEREF _Toc241229659 \h </w:instrText>
             </w:r>
             <w:r>
               <w:rPr>
@@ -2919,13 +2916,13 @@
               <w14:ligatures w14:val="standardContextual"/>
             </w:rPr>
           </w:pPr>
-          <w:hyperlink w:anchor="_Toc241143706" w:history="1">
+          <w:hyperlink w:anchor="_Toc241229660" w:history="1">
             <w:r>
               <w:rPr>
                 <w:rStyle w:val="Lienhypertexte"/>
                 <w:noProof/>
               </w:rPr>
-              <w:t>Kirima, the Wild Heart (SKE)</w:t>
+              <w:t>Kirima, l’Âme de la Bête (SKE)</w:t>
             </w:r>
             <w:r>
               <w:rPr>
@@ -2946,7 +2943,7 @@
                 <w:noProof/>
                 <w:webHidden/>
               </w:rPr>
-              <w:instrText xml:space="preserve"> PAGEREF _Toc241143706 \h </w:instrText>
+              <w:instrText xml:space="preserve"> PAGEREF _Toc241229660 \h </w:instrText>
             </w:r>
             <w:r>
               <w:rPr>
@@ -2991,13 +2988,13 @@
               <w14:ligatures w14:val="standardContextual"/>
             </w:rPr>
           </w:pPr>
-          <w:hyperlink w:anchor="_Toc241143707" w:history="1">
+          <w:hyperlink w:anchor="_Toc241229661" w:history="1">
             <w:r>
               <w:rPr>
                 <w:rStyle w:val="Lienhypertexte"/>
                 <w:noProof/>
               </w:rPr>
-              <w:t>Valduk, the Bersker (Regent)</w:t>
+              <w:t>Valduk, le Berserker (Regent)</w:t>
             </w:r>
             <w:r>
               <w:rPr>
@@ -3018,7 +3015,7 @@
                 <w:noProof/>
                 <w:webHidden/>
               </w:rPr>
-              <w:instrText xml:space="preserve"> PAGEREF _Toc241143707 \h </w:instrText>
+              <w:instrText xml:space="preserve"> PAGEREF _Toc241229661 \h </w:instrText>
             </w:r>
             <w:r>
               <w:rPr>
@@ -3063,7 +3060,7 @@
               <w14:ligatures w14:val="standardContextual"/>
             </w:rPr>
           </w:pPr>
-          <w:hyperlink w:anchor="_Toc241143708" w:history="1">
+          <w:hyperlink w:anchor="_Toc241229662" w:history="1">
             <w:r>
               <w:rPr>
                 <w:rStyle w:val="Lienhypertexte"/>
@@ -3090,7 +3087,7 @@
                 <w:noProof/>
                 <w:webHidden/>
               </w:rPr>
-              <w:instrText xml:space="preserve"> PAGEREF _Toc241143708 \h </w:instrText>
+              <w:instrText xml:space="preserve"> PAGEREF _Toc241229662 \h </w:instrText>
             </w:r>
             <w:r>
               <w:rPr>
@@ -3135,13 +3132,13 @@
               <w14:ligatures w14:val="standardContextual"/>
             </w:rPr>
           </w:pPr>
-          <w:hyperlink w:anchor="_Toc241143709" w:history="1">
+          <w:hyperlink w:anchor="_Toc241229663" w:history="1">
             <w:r>
               <w:rPr>
                 <w:rStyle w:val="Lienhypertexte"/>
                 <w:noProof/>
               </w:rPr>
-              <w:t>Doctor Sidhar, the Artificer (SKE)</w:t>
+              <w:t>Docteur Sidhar, l’Artificier (SKE)</w:t>
             </w:r>
             <w:r>
               <w:rPr>
@@ -3162,7 +3159,7 @@
                 <w:noProof/>
                 <w:webHidden/>
               </w:rPr>
-              <w:instrText xml:space="preserve"> PAGEREF _Toc241143709 \h </w:instrText>
+              <w:instrText xml:space="preserve"> PAGEREF _Toc241229663 \h </w:instrText>
             </w:r>
             <w:r>
               <w:rPr>
@@ -3182,7 +3179,7 @@
                 <w:noProof/>
                 <w:webHidden/>
               </w:rPr>
-              <w:t>25</w:t>
+              <w:t>26</w:t>
             </w:r>
             <w:r>
               <w:rPr>
@@ -3208,18 +3205,18 @@
               <w:pgSz w:w="11906" w:h="16838"/>
               <w:pgMar w:top="1417" w:right="1417" w:bottom="1417" w:left="1417" w:header="708" w:footer="708" w:gutter="0"/>
               <w:pgNumType w:fmt="lowerRoman" w:start="1"/>
-              <w:cols w:num="2" w:sep="1" w:space="709"/>
+              <w:cols w:num="2" w:space="708"/>
               <w:titlePg/>
               <w:docGrid w:linePitch="360"/>
             </w:sectPr>
           </w:pPr>
-          <w:hyperlink w:anchor="_Toc241143710" w:history="1">
+          <w:hyperlink w:anchor="_Toc241229664" w:history="1">
             <w:r>
               <w:rPr>
                 <w:rStyle w:val="Lienhypertexte"/>
                 <w:noProof/>
               </w:rPr>
-              <w:t>Lady Lorraine, the Ranger (Regent)</w:t>
+              <w:t>Lady Lorraine, le Rôdeur (Regent)</w:t>
             </w:r>
             <w:r>
               <w:rPr>
@@ -3240,7 +3237,7 @@
                 <w:noProof/>
                 <w:webHidden/>
               </w:rPr>
-              <w:instrText xml:space="preserve"> PAGEREF _Toc241143710 \h </w:instrText>
+              <w:instrText xml:space="preserve"> PAGEREF _Toc241229664 \h </w:instrText>
             </w:r>
             <w:r>
               <w:rPr>
@@ -3260,7 +3257,7 @@
                 <w:noProof/>
                 <w:webHidden/>
               </w:rPr>
-              <w:t>26</w:t>
+              <w:t>27</w:t>
             </w:r>
             <w:r>
               <w:rPr>
@@ -3314,7 +3311,7 @@
       <w:pPr>
         <w:pStyle w:val="Titre1"/>
       </w:pPr>
-      <w:bookmarkStart w:id="0" w:name="_Toc241143670"/>
+      <w:bookmarkStart w:id="0" w:name="_Toc241229624"/>
       <w:r>
         <w:lastRenderedPageBreak/>
         <w:t>Objecti</w:t>
@@ -3405,7 +3402,7 @@
       <w:pPr>
         <w:pStyle w:val="Titre2"/>
       </w:pPr>
-      <w:bookmarkStart w:id="1" w:name="_Toc241143671"/>
+      <w:bookmarkStart w:id="1" w:name="_Toc241229625"/>
       <w:r>
         <w:t>Conten</w:t>
       </w:r>
@@ -3486,7 +3483,7 @@
       <w:pPr>
         <w:pStyle w:val="Titre2"/>
       </w:pPr>
-      <w:bookmarkStart w:id="2" w:name="_Toc241143672"/>
+      <w:bookmarkStart w:id="2" w:name="_Toc241229626"/>
       <w:r>
         <w:rPr>
           <w:rStyle w:val="Accentuationlgre"/>
@@ -3775,7 +3772,7 @@
       <w:pPr>
         <w:pStyle w:val="Titre2"/>
       </w:pPr>
-      <w:bookmarkStart w:id="3" w:name="_Toc241143673"/>
+      <w:bookmarkStart w:id="3" w:name="_Toc241229627"/>
       <w:r>
         <w:lastRenderedPageBreak/>
         <w:t xml:space="preserve">Déroulement du </w:t>
@@ -3827,7 +3824,7 @@
       <w:pPr>
         <w:pStyle w:val="Titre3"/>
       </w:pPr>
-      <w:bookmarkStart w:id="4" w:name="_Toc241143674"/>
+      <w:bookmarkStart w:id="4" w:name="_Toc241229628"/>
       <w:r>
         <w:t xml:space="preserve">Entrer dans une </w:t>
       </w:r>
@@ -4086,7 +4083,7 @@
       <w:pPr>
         <w:pStyle w:val="Titre3"/>
       </w:pPr>
-      <w:bookmarkStart w:id="5" w:name="_Toc241143675"/>
+      <w:bookmarkStart w:id="5" w:name="_Toc241229629"/>
       <w:r>
         <w:t xml:space="preserve">Entrer dans une </w:t>
       </w:r>
@@ -4505,10 +4502,7 @@
     </w:p>
     <w:p>
       <w:r>
-        <w:t xml:space="preserve">À la fin de chaque tour, l'un des quatre scénarios suivants peut se </w:t>
-      </w:r>
-      <w:r>
-        <w:t>produire</w:t>
+        <w:t>À la fin de chaque tour, l'un des quatre scénarios suivants peut se produire</w:t>
       </w:r>
       <w:r>
         <w:t> :</w:t>
@@ -4667,7 +4661,7 @@
       <w:pPr>
         <w:pStyle w:val="Titre3"/>
       </w:pPr>
-      <w:bookmarkStart w:id="6" w:name="_Toc241143676"/>
+      <w:bookmarkStart w:id="6" w:name="_Toc241229630"/>
       <w:r>
         <w:lastRenderedPageBreak/>
         <w:t>Compagnons de Battaile</w:t>
@@ -5597,7 +5591,7 @@
       <w:pPr>
         <w:pStyle w:val="Titre1"/>
       </w:pPr>
-      <w:bookmarkStart w:id="7" w:name="_Toc241143677"/>
+      <w:bookmarkStart w:id="7" w:name="_Toc241229631"/>
       <w:r>
         <w:lastRenderedPageBreak/>
         <w:t>Bestiaire</w:t>
@@ -5702,7 +5696,7 @@
       <w:pPr>
         <w:pStyle w:val="Titre2"/>
       </w:pPr>
-      <w:bookmarkStart w:id="8" w:name="_Toc241143678"/>
+      <w:bookmarkStart w:id="8" w:name="_Toc241229632"/>
       <w:r>
         <w:t>Armes</w:t>
       </w:r>
@@ -5712,7 +5706,7 @@
       <w:pPr>
         <w:pStyle w:val="Titre3"/>
       </w:pPr>
-      <w:bookmarkStart w:id="9" w:name="_Toc241143679"/>
+      <w:bookmarkStart w:id="9" w:name="_Toc241229633"/>
       <w:r>
         <w:t>Rat</w:t>
       </w:r>
@@ -6115,7 +6109,7 @@
       <w:pPr>
         <w:pStyle w:val="Titre3"/>
       </w:pPr>
-      <w:bookmarkStart w:id="10" w:name="_Toc241143680"/>
+      <w:bookmarkStart w:id="10" w:name="_Toc241229634"/>
       <w:r>
         <w:t>Squelette Spadassin</w:t>
       </w:r>
@@ -6476,7 +6470,7 @@
       <w:pPr>
         <w:pStyle w:val="Titre3"/>
       </w:pPr>
-      <w:bookmarkStart w:id="11" w:name="_Toc241143681"/>
+      <w:bookmarkStart w:id="11" w:name="_Toc241229635"/>
       <w:r>
         <w:lastRenderedPageBreak/>
         <w:t>Roi des Squelettes</w:t>
@@ -6832,7 +6826,7 @@
       <w:pPr>
         <w:pStyle w:val="Titre3"/>
       </w:pPr>
-      <w:bookmarkStart w:id="12" w:name="_Toc241143682"/>
+      <w:bookmarkStart w:id="12" w:name="_Toc241229636"/>
       <w:r>
         <w:t>Dagues, Épées et Haches</w:t>
       </w:r>
@@ -7175,7 +7169,7 @@
       <w:pPr>
         <w:pStyle w:val="Titre2"/>
       </w:pPr>
-      <w:bookmarkStart w:id="13" w:name="_Toc241143683"/>
+      <w:bookmarkStart w:id="13" w:name="_Toc241229637"/>
       <w:r>
         <w:lastRenderedPageBreak/>
         <w:t>Parchemins Magiques</w:t>
@@ -7186,7 +7180,7 @@
       <w:pPr>
         <w:pStyle w:val="Titre3"/>
       </w:pPr>
-      <w:bookmarkStart w:id="14" w:name="_Toc241143684"/>
+      <w:bookmarkStart w:id="14" w:name="_Toc241229638"/>
       <w:r>
         <w:t>Momie</w:t>
       </w:r>
@@ -7641,7 +7635,7 @@
       <w:pPr>
         <w:pStyle w:val="Titre3"/>
       </w:pPr>
-      <w:bookmarkStart w:id="15" w:name="_Toc241143685"/>
+      <w:bookmarkStart w:id="15" w:name="_Toc241229639"/>
       <w:r>
         <w:t>La Malédiction de Karak</w:t>
       </w:r>
@@ -7673,7 +7667,7 @@
       <w:pPr>
         <w:pStyle w:val="Titre3"/>
       </w:pPr>
-      <w:bookmarkStart w:id="16" w:name="_Toc241143686"/>
+      <w:bookmarkStart w:id="16" w:name="_Toc241229640"/>
       <w:r>
         <w:t>Types de Dégâts</w:t>
       </w:r>
@@ -7758,7 +7752,7 @@
       <w:pPr>
         <w:pStyle w:val="Titre3"/>
       </w:pPr>
-      <w:bookmarkStart w:id="17" w:name="_Toc241143687"/>
+      <w:bookmarkStart w:id="17" w:name="_Toc241229641"/>
       <w:r>
         <w:t>Parchemin de Feu</w:t>
       </w:r>
@@ -7801,7 +7795,7 @@
       <w:pPr>
         <w:pStyle w:val="Titre3"/>
       </w:pPr>
-      <w:bookmarkStart w:id="18" w:name="_Toc241143688"/>
+      <w:bookmarkStart w:id="18" w:name="_Toc241229642"/>
       <w:r>
         <w:lastRenderedPageBreak/>
         <w:t>Araignée Géante</w:t>
@@ -8200,7 +8194,7 @@
       <w:pPr>
         <w:pStyle w:val="Titre3"/>
       </w:pPr>
-      <w:bookmarkStart w:id="19" w:name="_Toc241143689"/>
+      <w:bookmarkStart w:id="19" w:name="_Toc241229643"/>
       <w:r>
         <w:rPr>
           <w:rStyle w:val="Accentuationlgre"/>
@@ -8302,7 +8296,7 @@
       <w:pPr>
         <w:pStyle w:val="Titre3"/>
       </w:pPr>
-      <w:bookmarkStart w:id="20" w:name="_Toc241143690"/>
+      <w:bookmarkStart w:id="20" w:name="_Toc241229644"/>
       <w:r>
         <w:t>Parchemin de Guérison</w:t>
       </w:r>
@@ -8405,7 +8399,7 @@
       <w:pPr>
         <w:pStyle w:val="Titre2"/>
       </w:pPr>
-      <w:bookmarkStart w:id="21" w:name="_Toc241143691"/>
+      <w:bookmarkStart w:id="21" w:name="_Toc241229645"/>
       <w:r>
         <w:lastRenderedPageBreak/>
         <w:t>Trésor</w:t>
@@ -8416,7 +8410,7 @@
       <w:pPr>
         <w:pStyle w:val="Titre3"/>
       </w:pPr>
-      <w:bookmarkStart w:id="22" w:name="_Toc241143692"/>
+      <w:bookmarkStart w:id="22" w:name="_Toc241229646"/>
       <w:r>
         <w:t>Squelette Gardien de la Clé</w:t>
       </w:r>
@@ -8795,7 +8789,7 @@
       <w:pPr>
         <w:pStyle w:val="Titre3"/>
       </w:pPr>
-      <w:bookmarkStart w:id="23" w:name="_Toc241143693"/>
+      <w:bookmarkStart w:id="23" w:name="_Toc241229647"/>
       <w:r>
         <w:t>Spectre</w:t>
       </w:r>
@@ -9153,7 +9147,7 @@
       <w:pPr>
         <w:pStyle w:val="Titre3"/>
       </w:pPr>
-      <w:bookmarkStart w:id="24" w:name="_Toc241143694"/>
+      <w:bookmarkStart w:id="24" w:name="_Toc241229648"/>
       <w:r>
         <w:lastRenderedPageBreak/>
         <w:t>Le</w:t>
@@ -9518,7 +9512,7 @@
       <w:pPr>
         <w:pStyle w:val="Titre3"/>
       </w:pPr>
-      <w:bookmarkStart w:id="25" w:name="_Toc241143695"/>
+      <w:bookmarkStart w:id="25" w:name="_Toc241229649"/>
       <w:r>
         <w:rPr>
           <w:rStyle w:val="Accentuationlgre"/>
@@ -9846,7 +9840,7 @@
       <w:pPr>
         <w:pStyle w:val="Titre1"/>
       </w:pPr>
-      <w:bookmarkStart w:id="26" w:name="_Toc241143696"/>
+      <w:bookmarkStart w:id="26" w:name="_Toc241229650"/>
       <w:r>
         <w:lastRenderedPageBreak/>
         <w:t>Les Héros</w:t>
@@ -9894,7 +9888,7 @@
       <w:pPr>
         <w:pStyle w:val="Titre3"/>
       </w:pPr>
-      <w:bookmarkStart w:id="27" w:name="_Toc241143697"/>
+      <w:bookmarkStart w:id="27" w:name="_Toc241229651"/>
       <w:r>
         <w:t>Lancement de Sorts</w:t>
       </w:r>
@@ -10050,7 +10044,7 @@
       <w:pPr>
         <w:pStyle w:val="Titre2"/>
       </w:pPr>
-      <w:bookmarkStart w:id="28" w:name="_Toc241143698"/>
+      <w:bookmarkStart w:id="28" w:name="_Toc241229652"/>
       <w:r>
         <w:t>Aderyn</w:t>
       </w:r>
@@ -10731,7 +10725,7 @@
       <w:pPr>
         <w:pStyle w:val="Titre2"/>
       </w:pPr>
-      <w:bookmarkStart w:id="29" w:name="_Toc241143699"/>
+      <w:bookmarkStart w:id="29" w:name="_Toc241229653"/>
       <w:r>
         <w:rPr>
           <w:noProof/>
@@ -11476,7 +11470,7 @@
       <w:pPr>
         <w:pStyle w:val="Titre2"/>
       </w:pPr>
-      <w:bookmarkStart w:id="30" w:name="_Toc241143700"/>
+      <w:bookmarkStart w:id="30" w:name="_Toc241229654"/>
       <w:r>
         <w:rPr>
           <w:noProof/>
@@ -12255,7 +12249,7 @@
       <w:pPr>
         <w:pStyle w:val="Titre2"/>
       </w:pPr>
-      <w:bookmarkStart w:id="31" w:name="_Toc241143701"/>
+      <w:bookmarkStart w:id="31" w:name="_Toc241229655"/>
       <w:r>
         <w:rPr>
           <w:noProof/>
@@ -13149,7 +13143,7 @@
         <w:pStyle w:val="Titre2"/>
         <w:ind w:left="0"/>
       </w:pPr>
-      <w:bookmarkStart w:id="32" w:name="_Toc241143702"/>
+      <w:bookmarkStart w:id="32" w:name="_Toc241229656"/>
       <w:r>
         <w:rPr>
           <w:noProof/>
@@ -13975,13 +13969,7 @@
         <w:t xml:space="preserve">. </w:t>
       </w:r>
       <w:r>
-        <w:t xml:space="preserve">Sur un succès, </w:t>
-      </w:r>
-      <w:r>
-        <w:t>Lord Xanrus</w:t>
-      </w:r>
-      <w:r>
-        <w:t xml:space="preserve"> inflige 1d6 + SAG dégâts</w:t>
+        <w:t>Sur un succès, Lord Xanrus inflige 1d6 + SAG dégâts</w:t>
       </w:r>
       <w:r>
         <w:t xml:space="preserve"> Physiques</w:t>
@@ -14167,7 +14155,7 @@
       <w:pPr>
         <w:pStyle w:val="Titre2"/>
       </w:pPr>
-      <w:bookmarkStart w:id="33" w:name="_Toc241143703"/>
+      <w:bookmarkStart w:id="33" w:name="_Toc241229657"/>
       <w:r>
         <w:rPr>
           <w:noProof/>
@@ -14257,10 +14245,10 @@
       <w:r>
         <w:t xml:space="preserve">, </w:t>
       </w:r>
+      <w:r>
+        <w:t>la Clerc</w:t>
+      </w:r>
       <w:bookmarkEnd w:id="33"/>
-      <w:r>
-        <w:t>la Clerc</w:t>
-      </w:r>
     </w:p>
     <w:p>
       <w:r>
@@ -15052,13 +15040,7 @@
         <w:t xml:space="preserve">. </w:t>
       </w:r>
       <w:r>
-        <w:t xml:space="preserve">S'il y a une arme dans l'emplacement d'Arme secondaire, Taia peut effectuer </w:t>
-      </w:r>
-      <w:r>
-        <w:t>une attaque</w:t>
-      </w:r>
-      <w:r>
-        <w:t xml:space="preserve"> avec elle ce tour</w:t>
+        <w:t>S'il y a une arme dans l'emplacement d'Arme secondaire, Taia peut effectuer une attaque avec elle ce tour</w:t>
       </w:r>
       <w:r>
         <w:t>.</w:t>
@@ -15168,7 +15150,7 @@
       <w:pPr>
         <w:pStyle w:val="Titre2"/>
       </w:pPr>
-      <w:bookmarkStart w:id="34" w:name="_Toc241143704"/>
+      <w:bookmarkStart w:id="34" w:name="_Toc241229658"/>
       <w:r>
         <w:rPr>
           <w:noProof/>
@@ -15939,7 +15921,7 @@
       <w:pPr>
         <w:pStyle w:val="Titre2"/>
       </w:pPr>
-      <w:bookmarkStart w:id="35" w:name="_Toc241143705"/>
+      <w:bookmarkStart w:id="35" w:name="_Toc241229659"/>
       <w:r>
         <w:rPr>
           <w:noProof/>
@@ -16662,10 +16644,7 @@
               <w:t xml:space="preserve">Hannah peut choisir de Foncer au début de son tour. Si elle le fait, elle a 8 mouvements ce tour mais ne que se déplacer dans des </w:t>
             </w:r>
             <w:r>
-              <w:t>Tuiles Découvertes</w:t>
-            </w:r>
-            <w:r>
-              <w:t>.</w:t>
+              <w:t>Tuiles Découvertes.</w:t>
             </w:r>
           </w:p>
           <w:p>
@@ -16699,7 +16678,7 @@
       <w:pPr>
         <w:pStyle w:val="Titre2"/>
       </w:pPr>
-      <w:bookmarkStart w:id="36" w:name="_Toc241143706"/>
+      <w:bookmarkStart w:id="36" w:name="_Toc241229660"/>
       <w:r>
         <w:rPr>
           <w:noProof/>
@@ -16875,13 +16854,7 @@
         <w:t xml:space="preserve"> </w:t>
       </w:r>
       <w:r>
-        <w:t>Attaque normale, 1d</w:t>
-      </w:r>
-      <w:r>
-        <w:t>8</w:t>
-      </w:r>
-      <w:r>
-        <w:t xml:space="preserve"> + Mod Dégâts de dégâts Physiques</w:t>
+        <w:t>Attaque normale, 1d8 + Mod Dégâts de dégâts Physiques</w:t>
       </w:r>
       <w:r>
         <w:t xml:space="preserve">. </w:t>
@@ -17462,7 +17435,7 @@
       <w:pPr>
         <w:pStyle w:val="Titre2"/>
       </w:pPr>
-      <w:bookmarkStart w:id="37" w:name="_Toc241143707"/>
+      <w:bookmarkStart w:id="37" w:name="_Toc241229661"/>
       <w:r>
         <w:rPr>
           <w:noProof/>
@@ -18236,7 +18209,7 @@
       <w:pPr>
         <w:pStyle w:val="Titre2"/>
       </w:pPr>
-      <w:bookmarkStart w:id="38" w:name="_Toc241143708"/>
+      <w:bookmarkStart w:id="38" w:name="_Toc241229662"/>
       <w:r>
         <w:rPr>
           <w:noProof/>
@@ -18739,19 +18712,7 @@
               <w:rPr>
                 <w:szCs w:val="22"/>
               </w:rPr>
-              <w:t xml:space="preserve">Le Baron Markul peut lancer </w:t>
-            </w:r>
-            <w:r>
-              <w:rPr>
-                <w:szCs w:val="22"/>
-              </w:rPr>
-              <w:t>Bouclier de Foi</w:t>
-            </w:r>
-            <w:r>
-              <w:rPr>
-                <w:szCs w:val="22"/>
-              </w:rPr>
-              <w:t xml:space="preserve"> sans utiliser un emplacement de sorts.</w:t>
+              <w:t>Le Baron Markul peut lancer Bouclier de Foi sans utiliser un emplacement de sorts.</w:t>
             </w:r>
           </w:p>
         </w:tc>
@@ -18995,19 +18956,7 @@
               <w:rPr>
                 <w:szCs w:val="22"/>
               </w:rPr>
-              <w:t>Au début de son tour, Baron Markul peut se déplacer vers n'importe quelle case découverte adjacente à un Monstre qui n'est pas actuellement en combat.</w:t>
-            </w:r>
-            <w:r>
-              <w:rPr>
-                <w:szCs w:val="22"/>
-              </w:rPr>
-              <w:t xml:space="preserve"> </w:t>
-            </w:r>
-            <w:r>
-              <w:rPr>
-                <w:szCs w:val="22"/>
-              </w:rPr>
-              <w:t>Il engage immédiatement le combat avec le Monstre se trouvant sur la case voisine</w:t>
+              <w:t>Au début de son tour, Baron Markul peut se déplacer vers n'importe quelle case découverte adjacente à un Monstre qui n'est pas actuellement en combat. Il engage immédiatement le combat avec le Monstre se trouvant sur la case voisine</w:t>
             </w:r>
             <w:r>
               <w:rPr>
@@ -19176,7 +19125,7 @@
       <w:pPr>
         <w:pStyle w:val="Titre2"/>
       </w:pPr>
-      <w:bookmarkStart w:id="39" w:name="_Toc241143709"/>
+      <w:bookmarkStart w:id="39" w:name="_Toc241229663"/>
       <w:r>
         <w:lastRenderedPageBreak/>
         <w:t>Doct</w:t>
@@ -19428,10 +19377,7 @@
         <w:t xml:space="preserve">r Sidhar </w:t>
       </w:r>
       <w:r>
-        <w:t xml:space="preserve">a deux Emplacements de Sorts pour ses sorts de </w:t>
-      </w:r>
-      <w:r>
-        <w:t>niveau.</w:t>
+        <w:t>a deux Emplacements de Sorts pour ses sorts de niveau.</w:t>
       </w:r>
     </w:p>
     <w:tbl>
@@ -20003,13 +19949,7 @@
         <w:t xml:space="preserve">. </w:t>
       </w:r>
       <w:r>
-        <w:t xml:space="preserve">Sur un succès, </w:t>
-      </w:r>
-      <w:r>
-        <w:t>Docteur Sidhar</w:t>
-      </w:r>
-      <w:r>
-        <w:t xml:space="preserve"> inflige 1d6 + SAG dégâts de feu</w:t>
+        <w:t>Sur un succès, Docteur Sidhar inflige 1d6 + SAG dégâts de feu</w:t>
       </w:r>
       <w:r>
         <w:t>.</w:t>
@@ -20086,7 +20026,7 @@
       <w:pPr>
         <w:pStyle w:val="Titre2"/>
       </w:pPr>
-      <w:bookmarkStart w:id="40" w:name="_Toc241143710"/>
+      <w:bookmarkStart w:id="40" w:name="_Toc241229664"/>
       <w:r>
         <w:rPr>
           <w:noProof/>
@@ -21095,7 +21035,7 @@
               <wp:lineTo x="1301" y="0"/>
             </wp:wrapPolygon>
           </wp:wrapTight>
-          <wp:docPr id="1991517718" name="Image 2"/>
+          <wp:docPr id="130419106" name="Image 2"/>
           <wp:cNvGraphicFramePr>
             <a:graphicFrameLocks xmlns:a="http://schemas.openxmlformats.org/drawingml/2006/main" noChangeAspect="1"/>
           </wp:cNvGraphicFramePr>
@@ -22791,6 +22731,7 @@
   <w:style w:type="character" w:default="1" w:styleId="Policepardfaut">
     <w:name w:val="Default Paragraph Font"/>
     <w:uiPriority w:val="1"/>
+    <w:semiHidden/>
     <w:unhideWhenUsed/>
   </w:style>
   <w:style w:type="table" w:default="1" w:styleId="TableauNormal">

</xml_diff>